<commit_message>
Documentación actualizada con los diagramas AWS y de diseño (6 figuras)
Co-Authored-By: Claude Opus 5.5 <noreply@anthropic.com>
</commit_message>
<xml_diff>
--- a/docs/Reu-X_Documentacion_Tecnica.docx
+++ b/docs/Reu-X_Documentacion_Tecnica.docx
@@ -448,10 +448,28 @@
     </w:p>
     <w:p>
       <w:pPr>
+        <w:spacing w:after="20" w:before="20"/>
+        <w:ind w:left="360"/>
+      </w:pPr>
+      <w:hyperlink w:history="1" w:anchor="sec_17">
+        <w:r>
+          <w:rPr>
+            <w:b w:val="false"/>
+            <w:bCs w:val="false"/>
+            <w:color w:val="1F2733"/>
+            <w:sz w:val="20"/>
+            <w:szCs w:val="20"/>
+          </w:rPr>
+          <w:t xml:space="preserve">3.4 Diagramas de diseño</w:t>
+        </w:r>
+      </w:hyperlink>
+    </w:p>
+    <w:p>
+      <w:pPr>
         <w:spacing w:after="20" w:before="140"/>
         <w:ind w:left="0"/>
       </w:pPr>
-      <w:hyperlink w:history="1" w:anchor="sec_17">
+      <w:hyperlink w:history="1" w:anchor="sec_18">
         <w:r>
           <w:rPr>
             <w:b/>
@@ -469,7 +487,7 @@
         <w:spacing w:after="20" w:before="20"/>
         <w:ind w:left="360"/>
       </w:pPr>
-      <w:hyperlink w:history="1" w:anchor="sec_18">
+      <w:hyperlink w:history="1" w:anchor="sec_19">
         <w:r>
           <w:rPr>
             <w:b w:val="false"/>
@@ -487,7 +505,7 @@
         <w:spacing w:after="20" w:before="20"/>
         <w:ind w:left="360"/>
       </w:pPr>
-      <w:hyperlink w:history="1" w:anchor="sec_19">
+      <w:hyperlink w:history="1" w:anchor="sec_20">
         <w:r>
           <w:rPr>
             <w:b w:val="false"/>
@@ -505,7 +523,7 @@
         <w:spacing w:after="20" w:before="20"/>
         <w:ind w:left="360"/>
       </w:pPr>
-      <w:hyperlink w:history="1" w:anchor="sec_20">
+      <w:hyperlink w:history="1" w:anchor="sec_21">
         <w:r>
           <w:rPr>
             <w:b w:val="false"/>
@@ -523,7 +541,7 @@
         <w:spacing w:after="20" w:before="20"/>
         <w:ind w:left="360"/>
       </w:pPr>
-      <w:hyperlink w:history="1" w:anchor="sec_21">
+      <w:hyperlink w:history="1" w:anchor="sec_22">
         <w:r>
           <w:rPr>
             <w:b w:val="false"/>
@@ -541,7 +559,7 @@
         <w:spacing w:after="20" w:before="20"/>
         <w:ind w:left="360"/>
       </w:pPr>
-      <w:hyperlink w:history="1" w:anchor="sec_22">
+      <w:hyperlink w:history="1" w:anchor="sec_23">
         <w:r>
           <w:rPr>
             <w:b w:val="false"/>
@@ -559,7 +577,7 @@
         <w:spacing w:after="20" w:before="20"/>
         <w:ind w:left="360"/>
       </w:pPr>
-      <w:hyperlink w:history="1" w:anchor="sec_23">
+      <w:hyperlink w:history="1" w:anchor="sec_24">
         <w:r>
           <w:rPr>
             <w:b w:val="false"/>
@@ -577,7 +595,7 @@
         <w:spacing w:after="20" w:before="20"/>
         <w:ind w:left="360"/>
       </w:pPr>
-      <w:hyperlink w:history="1" w:anchor="sec_24">
+      <w:hyperlink w:history="1" w:anchor="sec_25">
         <w:r>
           <w:rPr>
             <w:b w:val="false"/>
@@ -595,7 +613,7 @@
         <w:spacing w:after="20" w:before="20"/>
         <w:ind w:left="360"/>
       </w:pPr>
-      <w:hyperlink w:history="1" w:anchor="sec_25">
+      <w:hyperlink w:history="1" w:anchor="sec_26">
         <w:r>
           <w:rPr>
             <w:b w:val="false"/>
@@ -613,7 +631,7 @@
         <w:spacing w:after="20" w:before="140"/>
         <w:ind w:left="0"/>
       </w:pPr>
-      <w:hyperlink w:history="1" w:anchor="sec_26">
+      <w:hyperlink w:history="1" w:anchor="sec_27">
         <w:r>
           <w:rPr>
             <w:b/>
@@ -631,7 +649,7 @@
         <w:spacing w:after="20" w:before="20"/>
         <w:ind w:left="360"/>
       </w:pPr>
-      <w:hyperlink w:history="1" w:anchor="sec_27">
+      <w:hyperlink w:history="1" w:anchor="sec_28">
         <w:r>
           <w:rPr>
             <w:b w:val="false"/>
@@ -649,7 +667,7 @@
         <w:spacing w:after="20" w:before="20"/>
         <w:ind w:left="360"/>
       </w:pPr>
-      <w:hyperlink w:history="1" w:anchor="sec_28">
+      <w:hyperlink w:history="1" w:anchor="sec_29">
         <w:r>
           <w:rPr>
             <w:b w:val="false"/>
@@ -667,7 +685,7 @@
         <w:spacing w:after="20" w:before="140"/>
         <w:ind w:left="0"/>
       </w:pPr>
-      <w:hyperlink w:history="1" w:anchor="sec_29">
+      <w:hyperlink w:history="1" w:anchor="sec_30">
         <w:r>
           <w:rPr>
             <w:b/>
@@ -685,7 +703,7 @@
         <w:spacing w:after="20" w:before="20"/>
         <w:ind w:left="360"/>
       </w:pPr>
-      <w:hyperlink w:history="1" w:anchor="sec_30">
+      <w:hyperlink w:history="1" w:anchor="sec_31">
         <w:r>
           <w:rPr>
             <w:b w:val="false"/>
@@ -703,7 +721,7 @@
         <w:spacing w:after="20" w:before="20"/>
         <w:ind w:left="360"/>
       </w:pPr>
-      <w:hyperlink w:history="1" w:anchor="sec_31">
+      <w:hyperlink w:history="1" w:anchor="sec_32">
         <w:r>
           <w:rPr>
             <w:b w:val="false"/>
@@ -721,7 +739,7 @@
         <w:spacing w:after="20" w:before="20"/>
         <w:ind w:left="360"/>
       </w:pPr>
-      <w:hyperlink w:history="1" w:anchor="sec_32">
+      <w:hyperlink w:history="1" w:anchor="sec_33">
         <w:r>
           <w:rPr>
             <w:b w:val="false"/>
@@ -739,7 +757,7 @@
         <w:spacing w:after="20" w:before="20"/>
         <w:ind w:left="360"/>
       </w:pPr>
-      <w:hyperlink w:history="1" w:anchor="sec_33">
+      <w:hyperlink w:history="1" w:anchor="sec_34">
         <w:r>
           <w:rPr>
             <w:b w:val="false"/>
@@ -757,7 +775,7 @@
         <w:spacing w:after="20" w:before="20"/>
         <w:ind w:left="360"/>
       </w:pPr>
-      <w:hyperlink w:history="1" w:anchor="sec_34">
+      <w:hyperlink w:history="1" w:anchor="sec_35">
         <w:r>
           <w:rPr>
             <w:b w:val="false"/>
@@ -775,7 +793,7 @@
         <w:spacing w:after="20" w:before="20"/>
         <w:ind w:left="360"/>
       </w:pPr>
-      <w:hyperlink w:history="1" w:anchor="sec_35">
+      <w:hyperlink w:history="1" w:anchor="sec_36">
         <w:r>
           <w:rPr>
             <w:b w:val="false"/>
@@ -793,7 +811,7 @@
         <w:spacing w:after="20" w:before="20"/>
         <w:ind w:left="360"/>
       </w:pPr>
-      <w:hyperlink w:history="1" w:anchor="sec_36">
+      <w:hyperlink w:history="1" w:anchor="sec_37">
         <w:r>
           <w:rPr>
             <w:b w:val="false"/>
@@ -811,7 +829,7 @@
         <w:spacing w:after="20" w:before="140"/>
         <w:ind w:left="0"/>
       </w:pPr>
-      <w:hyperlink w:history="1" w:anchor="sec_37">
+      <w:hyperlink w:history="1" w:anchor="sec_38">
         <w:r>
           <w:rPr>
             <w:b/>
@@ -829,7 +847,7 @@
         <w:spacing w:after="20" w:before="20"/>
         <w:ind w:left="360"/>
       </w:pPr>
-      <w:hyperlink w:history="1" w:anchor="sec_38">
+      <w:hyperlink w:history="1" w:anchor="sec_39">
         <w:r>
           <w:rPr>
             <w:b w:val="false"/>
@@ -4036,7 +4054,7 @@
       <w:r>
         <w:drawing>
           <wp:inline distT="0" distB="0" distL="0" distR="0">
-            <wp:extent cx="5943600" cy="3790950"/>
+            <wp:extent cx="5943600" cy="3676650"/>
             <wp:effectExtent t="0" r="0" b="0" l="0"/>
             <wp:docPr id="1" name="" descr="" title=""/>
             <wp:cNvGraphicFramePr>
@@ -4061,7 +4079,7 @@
                   <pic:spPr bwMode="auto">
                     <a:xfrm>
                       <a:off x="0" y="0"/>
-                      <a:ext cx="5943600" cy="3790950"/>
+                      <a:ext cx="5943600" cy="3676650"/>
                     </a:xfrm>
                     <a:prstGeom prst="rect">
                       <a:avLst/>
@@ -4087,7 +4105,7 @@
           <w:sz w:val="18"/>
           <w:szCs w:val="18"/>
         </w:rPr>
-        <w:t xml:space="preserve">Figura 1. Arquitectura de Reu-X en AWS (región us-west-1).</w:t>
+        <w:t xml:space="preserve">Figura 1. Arquitectura de Reu-X en AWS (región us-west-1), con los íconos oficiales de cada servicio.</w:t>
       </w:r>
     </w:p>
     <w:p>
@@ -4098,7 +4116,7 @@
       <w:r>
         <w:drawing>
           <wp:inline distT="0" distB="0" distL="0" distR="0">
-            <wp:extent cx="5943600" cy="2381250"/>
+            <wp:extent cx="5943600" cy="3448050"/>
             <wp:effectExtent t="0" r="0" b="0" l="0"/>
             <wp:docPr id="2" name="" descr="" title=""/>
             <wp:cNvGraphicFramePr>
@@ -4123,6 +4141,68 @@
                   <pic:spPr bwMode="auto">
                     <a:xfrm>
                       <a:off x="0" y="0"/>
+                      <a:ext cx="5943600" cy="3448050"/>
+                    </a:xfrm>
+                    <a:prstGeom prst="rect">
+                      <a:avLst/>
+                    </a:prstGeom>
+                  </pic:spPr>
+                </pic:pic>
+              </a:graphicData>
+            </a:graphic>
+          </wp:inline>
+        </w:drawing>
+      </w:r>
+    </w:p>
+    <w:p>
+      <w:pPr>
+        <w:spacing w:after="200"/>
+        <w:jc w:val="center"/>
+      </w:pPr>
+      <w:r>
+        <w:rPr>
+          <w:i/>
+          <w:iCs/>
+          <w:color w:val="5B6574"/>
+          <w:sz w:val="18"/>
+          <w:szCs w:val="18"/>
+        </w:rPr>
+        <w:t xml:space="preserve">Figura 2. Núcleo de procesamiento: de la grabación a la minuta y los visuales (sin componentes de soporte).</w:t>
+      </w:r>
+    </w:p>
+    <w:p>
+      <w:pPr>
+        <w:spacing w:after="60" w:before="120"/>
+        <w:jc w:val="center"/>
+      </w:pPr>
+      <w:r>
+        <w:drawing>
+          <wp:inline distT="0" distB="0" distL="0" distR="0">
+            <wp:extent cx="5943600" cy="2381250"/>
+            <wp:effectExtent t="0" r="0" b="0" l="0"/>
+            <wp:docPr id="3" name="" descr="" title=""/>
+            <wp:cNvGraphicFramePr>
+              <a:graphicFrameLocks xmlns:a="http://schemas.openxmlformats.org/drawingml/2006/main" noChangeAspect="1"/>
+            </wp:cNvGraphicFramePr>
+            <a:graphic xmlns:a="http://schemas.openxmlformats.org/drawingml/2006/main">
+              <a:graphicData uri="http://schemas.openxmlformats.org/drawingml/2006/picture">
+                <pic:pic xmlns:pic="http://schemas.openxmlformats.org/drawingml/2006/picture">
+                  <pic:nvPicPr>
+                    <pic:cNvPr id="0" name="" descr=""/>
+                    <pic:cNvPicPr>
+                      <a:picLocks noChangeAspect="1" noChangeArrowheads="1"/>
+                    </pic:cNvPicPr>
+                  </pic:nvPicPr>
+                  <pic:blipFill>
+                    <a:blip r:embed="rId11" cstate="none"/>
+                    <a:srcRect/>
+                    <a:stretch>
+                      <a:fillRect/>
+                    </a:stretch>
+                  </pic:blipFill>
+                  <pic:spPr bwMode="auto">
+                    <a:xfrm>
+                      <a:off x="0" y="0"/>
                       <a:ext cx="5943600" cy="2381250"/>
                     </a:xfrm>
                     <a:prstGeom prst="rect">
@@ -4149,7 +4229,7 @@
           <w:sz w:val="18"/>
           <w:szCs w:val="18"/>
         </w:rPr>
-        <w:t xml:space="preserve">Figura 2. Flujo de procesamiento de una reunión.</w:t>
+        <w:t xml:space="preserve">Figura 3. Flujo de procesamiento de una reunión.</w:t>
       </w:r>
     </w:p>
     <w:p>
@@ -6360,24 +6440,378 @@
     </w:p>
     <w:p>
       <w:pPr>
+        <w:pStyle w:val="Heading2"/>
+      </w:pPr>
+      <w:bookmarkStart w:name="sec_17" w:id="17"/>
+      <w:r>
+        <w:t xml:space="preserve">3.4 Diagramas de diseño</w:t>
+      </w:r>
+      <w:bookmarkEnd w:id="17"/>
+    </w:p>
+    <w:p>
+      <w:pPr>
+        <w:spacing w:after="120" w:line="288"/>
+      </w:pPr>
+      <w:r>
+        <w:t xml:space="preserve">Los siguientes diagramas describen el sistema desde tres ángulos: los datos que maneja, las piezas de software que lo forman y los servicios que intervienen en cada capa.</w:t>
+      </w:r>
+    </w:p>
+    <w:p>
+      <w:pPr>
+        <w:pStyle w:val="Heading3"/>
+      </w:pPr>
+      <w:r>
+        <w:t xml:space="preserve">Diagrama de clases</w:t>
+      </w:r>
+    </w:p>
+    <w:p>
+      <w:pPr>
+        <w:spacing w:after="120" w:line="288"/>
+      </w:pPr>
+      <w:r>
+        <w:t xml:space="preserve">Muestra los modelos de datos —definidos como tipos de TypeScript con esquemas Zod— y los módulos del servidor (</w:t>
+      </w:r>
+      <w:r>
+        <w:rPr>
+          <w:rFonts w:ascii="Consolas" w:cs="Consolas" w:eastAsia="Consolas" w:hAnsi="Consolas"/>
+          <w:color w:val="1B2A41"/>
+          <w:sz w:val="19"/>
+          <w:szCs w:val="19"/>
+        </w:rPr>
+        <w:t xml:space="preserve">lib/</w:t>
+      </w:r>
+      <w:r>
+        <w:t xml:space="preserve">) con sus funciones principales. La </w:t>
+      </w:r>
+      <w:r>
+        <w:rPr>
+          <w:b/>
+          <w:bCs/>
+        </w:rPr>
+        <w:t xml:space="preserve">Minuta</w:t>
+      </w:r>
+      <w:r>
+        <w:t xml:space="preserve"> se compone de participantes, temas y tareas; los visuales (</w:t>
+      </w:r>
+      <w:r>
+        <w:rPr>
+          <w:b/>
+          <w:bCs/>
+        </w:rPr>
+        <w:t xml:space="preserve">Mapa</w:t>
+      </w:r>
+      <w:r>
+        <w:t xml:space="preserve">, </w:t>
+      </w:r>
+      <w:r>
+        <w:rPr>
+          <w:b/>
+          <w:bCs/>
+        </w:rPr>
+        <w:t xml:space="preserve">Infografia</w:t>
+      </w:r>
+      <w:r>
+        <w:t xml:space="preserve"> y </w:t>
+      </w:r>
+      <w:r>
+        <w:rPr>
+          <w:b/>
+          <w:bCs/>
+        </w:rPr>
+        <w:t xml:space="preserve">Flujo</w:t>
+      </w:r>
+      <w:r>
+        <w:t xml:space="preserve">) tienen sus propias partes; </w:t>
+      </w:r>
+      <w:r>
+        <w:rPr>
+          <w:b/>
+          <w:bCs/>
+        </w:rPr>
+        <w:t xml:space="preserve">Usuario</w:t>
+      </w:r>
+      <w:r>
+        <w:t xml:space="preserve"> y </w:t>
+      </w:r>
+      <w:r>
+        <w:rPr>
+          <w:b/>
+          <w:bCs/>
+        </w:rPr>
+        <w:t xml:space="preserve">Sesion</w:t>
+      </w:r>
+      <w:r>
+        <w:t xml:space="preserve"> sostienen el acceso y los perfiles.</w:t>
+      </w:r>
+    </w:p>
+    <w:p>
+      <w:pPr>
+        <w:spacing w:after="60" w:before="120"/>
+        <w:jc w:val="center"/>
+      </w:pPr>
+      <w:r>
+        <w:drawing>
+          <wp:inline distT="0" distB="0" distL="0" distR="0">
+            <wp:extent cx="5943600" cy="4610100"/>
+            <wp:effectExtent t="0" r="0" b="0" l="0"/>
+            <wp:docPr id="4" name="" descr="" title=""/>
+            <wp:cNvGraphicFramePr>
+              <a:graphicFrameLocks xmlns:a="http://schemas.openxmlformats.org/drawingml/2006/main" noChangeAspect="1"/>
+            </wp:cNvGraphicFramePr>
+            <a:graphic xmlns:a="http://schemas.openxmlformats.org/drawingml/2006/main">
+              <a:graphicData uri="http://schemas.openxmlformats.org/drawingml/2006/picture">
+                <pic:pic xmlns:pic="http://schemas.openxmlformats.org/drawingml/2006/picture">
+                  <pic:nvPicPr>
+                    <pic:cNvPr id="0" name="" descr=""/>
+                    <pic:cNvPicPr>
+                      <a:picLocks noChangeAspect="1" noChangeArrowheads="1"/>
+                    </pic:cNvPicPr>
+                  </pic:nvPicPr>
+                  <pic:blipFill>
+                    <a:blip r:embed="rId12" cstate="none"/>
+                    <a:srcRect/>
+                    <a:stretch>
+                      <a:fillRect/>
+                    </a:stretch>
+                  </pic:blipFill>
+                  <pic:spPr bwMode="auto">
+                    <a:xfrm>
+                      <a:off x="0" y="0"/>
+                      <a:ext cx="5943600" cy="4610100"/>
+                    </a:xfrm>
+                    <a:prstGeom prst="rect">
+                      <a:avLst/>
+                    </a:prstGeom>
+                  </pic:spPr>
+                </pic:pic>
+              </a:graphicData>
+            </a:graphic>
+          </wp:inline>
+        </w:drawing>
+      </w:r>
+    </w:p>
+    <w:p>
+      <w:pPr>
+        <w:spacing w:after="200"/>
+        <w:jc w:val="center"/>
+      </w:pPr>
+      <w:r>
+        <w:rPr>
+          <w:i/>
+          <w:iCs/>
+          <w:color w:val="5B6574"/>
+          <w:sz w:val="18"/>
+          <w:szCs w:val="18"/>
+        </w:rPr>
+        <w:t xml:space="preserve">Figura 4. Diagrama de clases: modelos de datos y módulos del servidor.</w:t>
+      </w:r>
+    </w:p>
+    <w:p>
+      <w:pPr>
+        <w:pStyle w:val="Heading3"/>
+      </w:pPr>
+      <w:r>
+        <w:t xml:space="preserve">Diagrama de componentes</w:t>
+      </w:r>
+    </w:p>
+    <w:p>
+      <w:pPr>
+        <w:spacing w:after="120" w:line="288"/>
+      </w:pPr>
+      <w:r>
+        <w:t xml:space="preserve">Separa lo que corre en el </w:t>
+      </w:r>
+      <w:r>
+        <w:rPr>
+          <w:b/>
+          <w:bCs/>
+        </w:rPr>
+        <w:t xml:space="preserve">navegador</w:t>
+      </w:r>
+      <w:r>
+        <w:t xml:space="preserve"> (pantalla principal, vista de minuta, visuales, exportación y administración) de lo que corre en el </w:t>
+      </w:r>
+      <w:r>
+        <w:rPr>
+          <w:b/>
+          <w:bCs/>
+        </w:rPr>
+        <w:t xml:space="preserve">servidor EC2</w:t>
+      </w:r>
+      <w:r>
+        <w:t xml:space="preserve"> (Caddy, proxy de acceso, tres grupos de API y tres servicios internos), y muestra las interfaces con </w:t>
+      </w:r>
+      <w:r>
+        <w:rPr>
+          <w:b/>
+          <w:bCs/>
+        </w:rPr>
+        <w:t xml:space="preserve">Amazon S3, Transcribe, Bedrock y Parameter Store</w:t>
+      </w:r>
+      <w:r>
+        <w:t xml:space="preserve">.</w:t>
+      </w:r>
+    </w:p>
+    <w:p>
+      <w:pPr>
+        <w:spacing w:after="60" w:before="120"/>
+        <w:jc w:val="center"/>
+      </w:pPr>
+      <w:r>
+        <w:drawing>
+          <wp:inline distT="0" distB="0" distL="0" distR="0">
+            <wp:extent cx="5943600" cy="3848100"/>
+            <wp:effectExtent t="0" r="0" b="0" l="0"/>
+            <wp:docPr id="5" name="" descr="" title=""/>
+            <wp:cNvGraphicFramePr>
+              <a:graphicFrameLocks xmlns:a="http://schemas.openxmlformats.org/drawingml/2006/main" noChangeAspect="1"/>
+            </wp:cNvGraphicFramePr>
+            <a:graphic xmlns:a="http://schemas.openxmlformats.org/drawingml/2006/main">
+              <a:graphicData uri="http://schemas.openxmlformats.org/drawingml/2006/picture">
+                <pic:pic xmlns:pic="http://schemas.openxmlformats.org/drawingml/2006/picture">
+                  <pic:nvPicPr>
+                    <pic:cNvPr id="0" name="" descr=""/>
+                    <pic:cNvPicPr>
+                      <a:picLocks noChangeAspect="1" noChangeArrowheads="1"/>
+                    </pic:cNvPicPr>
+                  </pic:nvPicPr>
+                  <pic:blipFill>
+                    <a:blip r:embed="rId13" cstate="none"/>
+                    <a:srcRect/>
+                    <a:stretch>
+                      <a:fillRect/>
+                    </a:stretch>
+                  </pic:blipFill>
+                  <pic:spPr bwMode="auto">
+                    <a:xfrm>
+                      <a:off x="0" y="0"/>
+                      <a:ext cx="5943600" cy="3848100"/>
+                    </a:xfrm>
+                    <a:prstGeom prst="rect">
+                      <a:avLst/>
+                    </a:prstGeom>
+                  </pic:spPr>
+                </pic:pic>
+              </a:graphicData>
+            </a:graphic>
+          </wp:inline>
+        </w:drawing>
+      </w:r>
+    </w:p>
+    <w:p>
+      <w:pPr>
+        <w:spacing w:after="200"/>
+        <w:jc w:val="center"/>
+      </w:pPr>
+      <w:r>
+        <w:rPr>
+          <w:i/>
+          <w:iCs/>
+          <w:color w:val="5B6574"/>
+          <w:sz w:val="18"/>
+          <w:szCs w:val="18"/>
+        </w:rPr>
+        <w:t xml:space="preserve">Figura 5. Diagrama de componentes: navegador, servidor y servicios de AWS.</w:t>
+      </w:r>
+    </w:p>
+    <w:p>
+      <w:pPr>
+        <w:pStyle w:val="Heading3"/>
+      </w:pPr>
+      <w:r>
+        <w:t xml:space="preserve">Arquitectura de servicios</w:t>
+      </w:r>
+    </w:p>
+    <w:p>
+      <w:pPr>
+        <w:spacing w:after="120" w:line="288"/>
+      </w:pPr>
+      <w:r>
+        <w:t xml:space="preserve">Organiza el sistema en cinco capas —presentación, borde y seguridad, servicios de aplicación (API), servicios de dominio e integración, y servicios de AWS— e indica qué servicio atiende cada responsabilidad.</w:t>
+      </w:r>
+    </w:p>
+    <w:p>
+      <w:pPr>
+        <w:spacing w:after="60" w:before="120"/>
+        <w:jc w:val="center"/>
+      </w:pPr>
+      <w:r>
+        <w:drawing>
+          <wp:inline distT="0" distB="0" distL="0" distR="0">
+            <wp:extent cx="5943600" cy="4076700"/>
+            <wp:effectExtent t="0" r="0" b="0" l="0"/>
+            <wp:docPr id="6" name="" descr="" title=""/>
+            <wp:cNvGraphicFramePr>
+              <a:graphicFrameLocks xmlns:a="http://schemas.openxmlformats.org/drawingml/2006/main" noChangeAspect="1"/>
+            </wp:cNvGraphicFramePr>
+            <a:graphic xmlns:a="http://schemas.openxmlformats.org/drawingml/2006/main">
+              <a:graphicData uri="http://schemas.openxmlformats.org/drawingml/2006/picture">
+                <pic:pic xmlns:pic="http://schemas.openxmlformats.org/drawingml/2006/picture">
+                  <pic:nvPicPr>
+                    <pic:cNvPr id="0" name="" descr=""/>
+                    <pic:cNvPicPr>
+                      <a:picLocks noChangeAspect="1" noChangeArrowheads="1"/>
+                    </pic:cNvPicPr>
+                  </pic:nvPicPr>
+                  <pic:blipFill>
+                    <a:blip r:embed="rId14" cstate="none"/>
+                    <a:srcRect/>
+                    <a:stretch>
+                      <a:fillRect/>
+                    </a:stretch>
+                  </pic:blipFill>
+                  <pic:spPr bwMode="auto">
+                    <a:xfrm>
+                      <a:off x="0" y="0"/>
+                      <a:ext cx="5943600" cy="4076700"/>
+                    </a:xfrm>
+                    <a:prstGeom prst="rect">
+                      <a:avLst/>
+                    </a:prstGeom>
+                  </pic:spPr>
+                </pic:pic>
+              </a:graphicData>
+            </a:graphic>
+          </wp:inline>
+        </w:drawing>
+      </w:r>
+    </w:p>
+    <w:p>
+      <w:pPr>
+        <w:spacing w:after="200"/>
+        <w:jc w:val="center"/>
+      </w:pPr>
+      <w:r>
+        <w:rPr>
+          <w:i/>
+          <w:iCs/>
+          <w:color w:val="5B6574"/>
+          <w:sz w:val="18"/>
+          <w:szCs w:val="18"/>
+        </w:rPr>
+        <w:t xml:space="preserve">Figura 6. Arquitectura de servicios por capas.</w:t>
+      </w:r>
+    </w:p>
+    <w:p>
+      <w:pPr>
         <w:pStyle w:val="Heading1"/>
         <w:pageBreakBefore/>
       </w:pPr>
-      <w:bookmarkStart w:name="sec_17" w:id="17"/>
+      <w:bookmarkStart w:name="sec_18" w:id="18"/>
       <w:r>
         <w:t xml:space="preserve">4. Guía para programadores</w:t>
       </w:r>
-      <w:bookmarkEnd w:id="17"/>
+      <w:bookmarkEnd w:id="18"/>
     </w:p>
     <w:p>
       <w:pPr>
         <w:pStyle w:val="Heading2"/>
       </w:pPr>
-      <w:bookmarkStart w:name="sec_18" w:id="18"/>
+      <w:bookmarkStart w:name="sec_19" w:id="19"/>
       <w:r>
         <w:t xml:space="preserve">4.1 Stack tecnológico</w:t>
       </w:r>
-      <w:bookmarkEnd w:id="18"/>
+      <w:bookmarkEnd w:id="19"/>
     </w:p>
     <w:tbl>
       <w:tblPr>
@@ -6831,11 +7265,11 @@
       <w:pPr>
         <w:pStyle w:val="Heading2"/>
       </w:pPr>
-      <w:bookmarkStart w:name="sec_19" w:id="19"/>
+      <w:bookmarkStart w:name="sec_20" w:id="20"/>
       <w:r>
         <w:t xml:space="preserve">4.2 Estructura del repositorio</w:t>
       </w:r>
-      <w:bookmarkEnd w:id="19"/>
+      <w:bookmarkEnd w:id="20"/>
     </w:p>
     <w:tbl>
       <w:tblPr>
@@ -8129,11 +8563,11 @@
       <w:pPr>
         <w:pStyle w:val="Heading2"/>
       </w:pPr>
-      <w:bookmarkStart w:name="sec_20" w:id="20"/>
+      <w:bookmarkStart w:name="sec_21" w:id="21"/>
       <w:r>
         <w:t xml:space="preserve">4.3 API</w:t>
       </w:r>
-      <w:bookmarkEnd w:id="20"/>
+      <w:bookmarkEnd w:id="21"/>
     </w:p>
     <w:tbl>
       <w:tblPr>
@@ -9151,11 +9585,11 @@
       <w:pPr>
         <w:pStyle w:val="Heading2"/>
       </w:pPr>
-      <w:bookmarkStart w:name="sec_21" w:id="21"/>
+      <w:bookmarkStart w:name="sec_22" w:id="22"/>
       <w:r>
         <w:t xml:space="preserve">4.4 Modelo de la minuta</w:t>
       </w:r>
-      <w:bookmarkEnd w:id="21"/>
+      <w:bookmarkEnd w:id="22"/>
     </w:p>
     <w:p>
       <w:pPr>
@@ -10015,11 +10449,11 @@
       <w:pPr>
         <w:pStyle w:val="Heading2"/>
       </w:pPr>
-      <w:bookmarkStart w:name="sec_22" w:id="22"/>
+      <w:bookmarkStart w:name="sec_23" w:id="23"/>
       <w:r>
         <w:t xml:space="preserve">4.5 Integración con Claude</w:t>
       </w:r>
-      <w:bookmarkEnd w:id="22"/>
+      <w:bookmarkEnd w:id="23"/>
     </w:p>
     <w:p>
       <w:pPr>
@@ -10245,11 +10679,11 @@
       <w:pPr>
         <w:pStyle w:val="Heading2"/>
       </w:pPr>
-      <w:bookmarkStart w:name="sec_23" w:id="23"/>
+      <w:bookmarkStart w:name="sec_24" w:id="24"/>
       <w:r>
         <w:t xml:space="preserve">4.6 Usuarios y cuotas</w:t>
       </w:r>
-      <w:bookmarkEnd w:id="23"/>
+      <w:bookmarkEnd w:id="24"/>
     </w:p>
     <w:p>
       <w:pPr>
@@ -10307,11 +10741,11 @@
       <w:pPr>
         <w:pStyle w:val="Heading2"/>
       </w:pPr>
-      <w:bookmarkStart w:name="sec_24" w:id="24"/>
+      <w:bookmarkStart w:name="sec_25" w:id="25"/>
       <w:r>
         <w:t xml:space="preserve">4.7 Variables de entorno</w:t>
       </w:r>
-      <w:bookmarkEnd w:id="24"/>
+      <w:bookmarkEnd w:id="25"/>
     </w:p>
     <w:tbl>
       <w:tblPr>
@@ -10825,11 +11259,11 @@
       <w:pPr>
         <w:pStyle w:val="Heading2"/>
       </w:pPr>
-      <w:bookmarkStart w:name="sec_25" w:id="25"/>
+      <w:bookmarkStart w:name="sec_26" w:id="26"/>
       <w:r>
         <w:t xml:space="preserve">4.8 Desarrollo local</w:t>
       </w:r>
-      <w:bookmarkEnd w:id="25"/>
+      <w:bookmarkEnd w:id="26"/>
     </w:p>
     <w:p>
       <w:pPr>
@@ -10996,21 +11430,21 @@
         <w:pStyle w:val="Heading1"/>
         <w:pageBreakBefore/>
       </w:pPr>
-      <w:bookmarkStart w:name="sec_26" w:id="26"/>
+      <w:bookmarkStart w:name="sec_27" w:id="27"/>
       <w:r>
         <w:t xml:space="preserve">5. Infraestructura</w:t>
       </w:r>
-      <w:bookmarkEnd w:id="26"/>
+      <w:bookmarkEnd w:id="27"/>
     </w:p>
     <w:p>
       <w:pPr>
         <w:pStyle w:val="Heading2"/>
       </w:pPr>
-      <w:bookmarkStart w:name="sec_27" w:id="27"/>
+      <w:bookmarkStart w:name="sec_28" w:id="28"/>
       <w:r>
         <w:t xml:space="preserve">5.1 Stacks de CloudFormation</w:t>
       </w:r>
-      <w:bookmarkEnd w:id="27"/>
+      <w:bookmarkEnd w:id="28"/>
     </w:p>
     <w:tbl>
       <w:tblPr>
@@ -11316,11 +11750,11 @@
       <w:pPr>
         <w:pStyle w:val="Heading2"/>
       </w:pPr>
-      <w:bookmarkStart w:name="sec_28" w:id="28"/>
+      <w:bookmarkStart w:name="sec_29" w:id="29"/>
       <w:r>
         <w:t xml:space="preserve">5.2 Servidor</w:t>
       </w:r>
-      <w:bookmarkEnd w:id="28"/>
+      <w:bookmarkEnd w:id="29"/>
     </w:p>
     <w:tbl>
       <w:tblPr>
@@ -11775,21 +12209,21 @@
         <w:pStyle w:val="Heading1"/>
         <w:pageBreakBefore/>
       </w:pPr>
-      <w:bookmarkStart w:name="sec_29" w:id="29"/>
+      <w:bookmarkStart w:name="sec_30" w:id="30"/>
       <w:r>
         <w:t xml:space="preserve">6. Operación</w:t>
       </w:r>
-      <w:bookmarkEnd w:id="29"/>
+      <w:bookmarkEnd w:id="30"/>
     </w:p>
     <w:p>
       <w:pPr>
         <w:pStyle w:val="Heading2"/>
       </w:pPr>
-      <w:bookmarkStart w:name="sec_30" w:id="30"/>
+      <w:bookmarkStart w:name="sec_31" w:id="31"/>
       <w:r>
         <w:t xml:space="preserve">6.1 Publicar una nueva versión</w:t>
       </w:r>
-      <w:bookmarkEnd w:id="30"/>
+      <w:bookmarkEnd w:id="31"/>
     </w:p>
     <w:p>
       <w:pPr>
@@ -11900,11 +12334,11 @@
       <w:pPr>
         <w:pStyle w:val="Heading2"/>
       </w:pPr>
-      <w:bookmarkStart w:name="sec_31" w:id="31"/>
+      <w:bookmarkStart w:name="sec_32" w:id="32"/>
       <w:r>
         <w:t xml:space="preserve">6.2 Ver el estado y los registros</w:t>
       </w:r>
-      <w:bookmarkEnd w:id="31"/>
+      <w:bookmarkEnd w:id="32"/>
     </w:p>
     <w:p>
       <w:pPr>
@@ -11999,11 +12433,11 @@
       <w:pPr>
         <w:pStyle w:val="Heading2"/>
       </w:pPr>
-      <w:bookmarkStart w:name="sec_32" w:id="32"/>
+      <w:bookmarkStart w:name="sec_33" w:id="33"/>
       <w:r>
         <w:t xml:space="preserve">6.3 Renovar la sesión de AWS en su computadora</w:t>
       </w:r>
-      <w:bookmarkEnd w:id="32"/>
+      <w:bookmarkEnd w:id="33"/>
     </w:p>
     <w:p>
       <w:pPr>
@@ -12050,11 +12484,11 @@
       <w:pPr>
         <w:pStyle w:val="Heading2"/>
       </w:pPr>
-      <w:bookmarkStart w:name="sec_33" w:id="33"/>
+      <w:bookmarkStart w:name="sec_34" w:id="34"/>
       <w:r>
         <w:t xml:space="preserve">6.4 Contraseña del administrador principal</w:t>
       </w:r>
-      <w:bookmarkEnd w:id="33"/>
+      <w:bookmarkEnd w:id="34"/>
     </w:p>
     <w:p>
       <w:pPr>
@@ -12157,11 +12591,11 @@
       <w:pPr>
         <w:pStyle w:val="Heading2"/>
       </w:pPr>
-      <w:bookmarkStart w:name="sec_34" w:id="34"/>
+      <w:bookmarkStart w:name="sec_35" w:id="35"/>
       <w:r>
         <w:t xml:space="preserve">6.5 Otras tareas</w:t>
       </w:r>
-      <w:bookmarkEnd w:id="34"/>
+      <w:bookmarkEnd w:id="35"/>
     </w:p>
     <w:tbl>
       <w:tblPr>
@@ -12555,11 +12989,11 @@
       <w:pPr>
         <w:pStyle w:val="Heading2"/>
       </w:pPr>
-      <w:bookmarkStart w:name="sec_35" w:id="35"/>
+      <w:bookmarkStart w:name="sec_36" w:id="36"/>
       <w:r>
         <w:t xml:space="preserve">6.6 Costos estimados (mensuales)</w:t>
       </w:r>
-      <w:bookmarkEnd w:id="35"/>
+      <w:bookmarkEnd w:id="36"/>
     </w:p>
     <w:tbl>
       <w:tblPr>
@@ -13310,11 +13744,11 @@
       <w:pPr>
         <w:pStyle w:val="Heading2"/>
       </w:pPr>
-      <w:bookmarkStart w:name="sec_36" w:id="36"/>
+      <w:bookmarkStart w:name="sec_37" w:id="37"/>
       <w:r>
         <w:t xml:space="preserve">6.7 Limitaciones conocidas y mejoras sugeridas</w:t>
       </w:r>
-      <w:bookmarkEnd w:id="36"/>
+      <w:bookmarkEnd w:id="37"/>
     </w:p>
     <w:p>
       <w:pPr>
@@ -13399,11 +13833,11 @@
         <w:pStyle w:val="Heading1"/>
         <w:pageBreakBefore/>
       </w:pPr>
-      <w:bookmarkStart w:name="sec_37" w:id="37"/>
+      <w:bookmarkStart w:name="sec_38" w:id="38"/>
       <w:r>
         <w:t xml:space="preserve">7. Referencias</w:t>
       </w:r>
-      <w:bookmarkEnd w:id="37"/>
+      <w:bookmarkEnd w:id="38"/>
     </w:p>
     <w:tbl>
       <w:tblPr>
@@ -13857,11 +14291,11 @@
       <w:pPr>
         <w:pStyle w:val="Heading2"/>
       </w:pPr>
-      <w:bookmarkStart w:name="sec_38" w:id="38"/>
+      <w:bookmarkStart w:name="sec_39" w:id="39"/>
       <w:r>
         <w:t xml:space="preserve">Glosario</w:t>
       </w:r>
-      <w:bookmarkEnd w:id="38"/>
+      <w:bookmarkEnd w:id="39"/>
     </w:p>
     <w:tbl>
       <w:tblPr>

</xml_diff>